<commit_message>
feat(officer): add role, location, and application deadline to company announcements in officer dashboard
</commit_message>
<xml_diff>
--- a/fixtures/announcements/20_reliance_industries_jd.docx
+++ b/fixtures/announcements/20_reliance_industries_jd.docx
@@ -7,7 +7,7 @@
         <w:pStyle w:val="Title"/>
       </w:pPr>
       <w:r>
-        <w:t>Recruitment Drive: Reliance Industries</w:t>
+        <w:t>Recruitment Drive: Reliance Industries - Graduate Engineering Trainee</w:t>
       </w:r>
     </w:p>
     <w:p>
@@ -25,7 +25,22 @@
     </w:p>
     <w:p>
       <w:r>
+        <w:t>Job Role: Graduate Engineering Trainee</w:t>
+      </w:r>
+    </w:p>
+    <w:p>
+      <w:r>
+        <w:t>Job Location: Mumbai / Jamnagar</w:t>
+      </w:r>
+    </w:p>
+    <w:p>
+      <w:r>
         <w:t>Drive Date: 2026-12-28</w:t>
+      </w:r>
+    </w:p>
+    <w:p>
+      <w:r>
+        <w:t>Application Deadline: 2026-12-21</w:t>
       </w:r>
     </w:p>
     <w:p>
@@ -109,7 +124,7 @@
     <w:p/>
     <w:p>
       <w:r>
-        <w:t>Students meeting the cut-offs are requested to register on the placement portal by Friday 5:00 PM.</w:t>
+        <w:t>Students meeting the cut-offs are requested to register on the placement portal by 2026-12-21 5:00 PM.</w:t>
       </w:r>
     </w:p>
     <w:sectPr>

</xml_diff>